<commit_message>
hoan thien thong bao
</commit_message>
<xml_diff>
--- a/src/main/resources/templates/ThongBao.docx
+++ b/src/main/resources/templates/ThongBao.docx
@@ -12,7 +12,6 @@
           <w:sz w:val="26"/>
         </w:rPr>
       </w:pPr>
-      <w:bookmarkStart w:id="0" w:name="_GoBack"/>
       <w:r>
         <w:rPr>
           <w:rFonts w:ascii="Times New Roman" w:hAnsi="Times New Roman"/>
@@ -200,7 +199,7 @@
           <w:sz w:val="26"/>
         </w:rPr>
         <w:tab/>
-        <w:t xml:space="preserve">Kính gửi: Ông(Bà)                  </w:t>
+        <w:t xml:space="preserve">Kính gửi: Ông(Bà)             </w:t>
       </w:r>
       <w:r>
         <w:rPr>
@@ -208,38 +207,14 @@
           <w:b/>
           <w:sz w:val="26"/>
         </w:rPr>
-        <w:t>{{khbd}}</w:t>
-      </w:r>
-      <w:r>
-        <w:rPr>
-          <w:rFonts w:ascii="Times New Roman" w:hAnsi="Times New Roman"/>
-          <w:b/>
-          <w:sz w:val="26"/>
-        </w:rPr>
-        <w:t xml:space="preserve"> </w:t>
-      </w:r>
-      <w:r>
-        <w:rPr>
-          <w:rFonts w:ascii="Times New Roman" w:hAnsi="Times New Roman"/>
-          <w:sz w:val="26"/>
-        </w:rPr>
-        <w:t>và</w:t>
-      </w:r>
-      <w:r>
-        <w:rPr>
-          <w:rFonts w:ascii="Times New Roman" w:hAnsi="Times New Roman"/>
-          <w:b/>
-          <w:sz w:val="26"/>
-        </w:rPr>
-        <w:t xml:space="preserve"> </w:t>
-      </w:r>
-      <w:r>
-        <w:rPr>
-          <w:rFonts w:ascii="Times New Roman" w:hAnsi="Times New Roman"/>
-          <w:b/>
-          <w:sz w:val="26"/>
-        </w:rPr>
-        <w:t>{{ntbdTB}}</w:t>
+        <w:t>{{nguoiNTB}}</w:t>
+      </w:r>
+      <w:r>
+        <w:rPr>
+          <w:rFonts w:ascii="Times New Roman" w:hAnsi="Times New Roman"/>
+          <w:sz w:val="26"/>
+        </w:rPr>
+        <w:t xml:space="preserve">     </w:t>
       </w:r>
     </w:p>
     <w:p>
@@ -458,7 +433,7 @@
           <w:rFonts w:ascii="Times New Roman" w:hAnsi="Times New Roman"/>
           <w:sz w:val="26"/>
         </w:rPr>
-        <w:t xml:space="preserve">                        </w:t>
+        <w:t xml:space="preserve">              </w:t>
       </w:r>
       <w:r>
         <w:rPr>
@@ -490,8 +465,10 @@
           <w:rFonts w:ascii="Times New Roman" w:hAnsi="Times New Roman"/>
           <w:sz w:val="26"/>
         </w:rPr>
-        <w:t xml:space="preserve">                            </w:t>
-      </w:r>
+        <w:t xml:space="preserve">                    </w:t>
+      </w:r>
+      <w:bookmarkStart w:id="0" w:name="_GoBack"/>
+      <w:bookmarkEnd w:id="0"/>
       <w:r>
         <w:rPr>
           <w:rFonts w:ascii="Times New Roman" w:hAnsi="Times New Roman"/>
@@ -516,7 +493,6 @@
         </w:rPr>
         <w:t xml:space="preserve">            - Lưu hồ sơ thế chấp</w:t>
       </w:r>
-      <w:bookmarkEnd w:id="0"/>
     </w:p>
     <w:sectPr>
       <w:pgSz w:w="11906" w:h="16838" w:code="9"/>
@@ -1440,7 +1416,7 @@
 </file>
 
 <file path=customXml/itemProps1.xml><?xml version="1.0" encoding="utf-8"?>
-<ds:datastoreItem xmlns:ds="http://schemas.openxmlformats.org/officeDocument/2006/customXml" ds:itemID="{6564066D-4D51-45F9-8AEF-FCCC28150D02}">
+<ds:datastoreItem xmlns:ds="http://schemas.openxmlformats.org/officeDocument/2006/customXml" ds:itemID="{CFC45E27-FBCF-43A8-BE5F-5A17169C13A4}">
   <ds:schemaRefs>
     <ds:schemaRef ds:uri="http://schemas.openxmlformats.org/officeDocument/2006/bibliography"/>
   </ds:schemaRefs>

</xml_diff>